<commit_message>
starting on centralized login work
</commit_message>
<xml_diff>
--- a/tutorial/DNA_Parts_with_sequences.docx
+++ b/tutorial/DNA_Parts_with_sequences.docx
@@ -42,9 +42,11 @@
             <w:vAlign w:val="center"/>
           </w:tcPr>
           <w:p>
+            <w:proofErr w:type="spellStart"/>
             <w:r>
               <w:t>amp_R</w:t>
             </w:r>
+            <w:proofErr w:type="spellEnd"/>
           </w:p>
         </w:tc>
         <w:tc>
@@ -340,7 +342,15 @@
             <w:vAlign w:val="center"/>
           </w:tcPr>
           <w:p>
-            <w:r>
+            <w:pPr>
+              <w:rPr>
+                <w:highlight w:val="yellow"/>
+              </w:rPr>
+            </w:pPr>
+            <w:r>
+              <w:rPr>
+                <w:highlight w:val="yellow"/>
+              </w:rPr>
               <w:t>DT19</w:t>
             </w:r>
           </w:p>
@@ -350,14 +360,28 @@
             <w:tcW w:w="7920" w:type="dxa"/>
           </w:tcPr>
           <w:p>
-            <w:r>
+            <w:pPr>
+              <w:rPr>
+                <w:highlight w:val="yellow"/>
+              </w:rPr>
+            </w:pPr>
+            <w:r>
+              <w:rPr>
+                <w:highlight w:val="yellow"/>
+              </w:rPr>
               <w:t>TTCAGCCAAAAAACTTAAGACCGCCGGTCTTGTCCACTACCTTGCAGTAATGCGGTGGACAGGATCGGCG</w:t>
             </w:r>
             <w:r>
+              <w:rPr>
+                <w:highlight w:val="yellow"/>
+              </w:rPr>
               <w:br/>
               <w:t>GTTTTCTTTTCTCTTCTCAACTCGGTACCAAAGACGAACAATAAGACGCTGAAAAGCGTCTTTTTTCGTT</w:t>
             </w:r>
             <w:r>
+              <w:rPr>
+                <w:highlight w:val="yellow"/>
+              </w:rPr>
               <w:br/>
               <w:t>TTGGTCC</w:t>
             </w:r>
@@ -391,7 +415,15 @@
             <w:vAlign w:val="center"/>
           </w:tcPr>
           <w:p>
-            <w:r>
+            <w:pPr>
+              <w:rPr>
+                <w:highlight w:val="yellow"/>
+              </w:rPr>
+            </w:pPr>
+            <w:r>
+              <w:rPr>
+                <w:highlight w:val="yellow"/>
+              </w:rPr>
               <w:lastRenderedPageBreak/>
               <w:t>DT36</w:t>
             </w:r>
@@ -402,10 +434,21 @@
             <w:tcW w:w="7920" w:type="dxa"/>
           </w:tcPr>
           <w:p>
-            <w:r>
+            <w:pPr>
+              <w:rPr>
+                <w:highlight w:val="yellow"/>
+              </w:rPr>
+            </w:pPr>
+            <w:r>
+              <w:rPr>
+                <w:highlight w:val="yellow"/>
+              </w:rPr>
               <w:t>GATCTAACTAAAAAGGCCGCTCTGCGGCCTTTTTTCTTTTCACTGTAACAACGGAAACCGGCCATTGCGC</w:t>
             </w:r>
             <w:r>
+              <w:rPr>
+                <w:highlight w:val="yellow"/>
+              </w:rPr>
               <w:br/>
               <w:t>CGGTTTTTTTTGGCCT</w:t>
             </w:r>
@@ -525,9 +568,11 @@
             <w:vAlign w:val="center"/>
           </w:tcPr>
           <w:p>
+            <w:proofErr w:type="spellStart"/>
             <w:r>
               <w:t>gm_R</w:t>
             </w:r>
+            <w:proofErr w:type="spellEnd"/>
           </w:p>
         </w:tc>
         <w:tc>
@@ -650,13 +695,14 @@
             </w:r>
             <w:r>
               <w:br/>
-              <w:t>AGCATGTGGCCCAGAATAAAATCAGGAGAATATGTACTCATTGAGCCTAACACCAAAGTATTCCCGGGTG</w:t>
-            </w:r>
-            <w:r>
-              <w:br/>
+              <w:t>AGCATGTGGCCCAGAATAAAATCAGGAGAATATGTACTCATTGAGCCTAACACCAAAGTATTCC</w:t>
             </w:r>
             <w:r>
               <w:lastRenderedPageBreak/>
+              <w:t>CGGGTG</w:t>
+            </w:r>
+            <w:r>
+              <w:br/>
               <w:t>ATGAGGTGTTTGTCAGAACCGTTGAAGGACACAACATGATTAAGGTTCTTGGCTATGACAGAGATGGAGA</w:t>
             </w:r>
             <w:r>
@@ -681,10 +727,12 @@
             <w:vAlign w:val="center"/>
           </w:tcPr>
           <w:p>
+            <w:proofErr w:type="spellStart"/>
             <w:r>
               <w:lastRenderedPageBreak/>
               <w:t>kan_R</w:t>
             </w:r>
+            <w:proofErr w:type="spellEnd"/>
           </w:p>
         </w:tc>
         <w:tc>
@@ -749,9 +797,11 @@
             <w:vAlign w:val="center"/>
           </w:tcPr>
           <w:p>
+            <w:proofErr w:type="spellStart"/>
             <w:r>
               <w:t>luxI</w:t>
             </w:r>
+            <w:proofErr w:type="spellEnd"/>
           </w:p>
         </w:tc>
         <w:tc>
@@ -804,10 +854,12 @@
             <w:vAlign w:val="center"/>
           </w:tcPr>
           <w:p>
+            <w:proofErr w:type="spellStart"/>
             <w:r>
               <w:lastRenderedPageBreak/>
               <w:t>oriT</w:t>
             </w:r>
+            <w:proofErr w:type="spellEnd"/>
           </w:p>
         </w:tc>
         <w:tc>
@@ -840,9 +892,11 @@
             <w:vAlign w:val="center"/>
           </w:tcPr>
           <w:p>
+            <w:proofErr w:type="spellStart"/>
             <w:r>
               <w:t>P_Bad</w:t>
             </w:r>
+            <w:proofErr w:type="spellEnd"/>
           </w:p>
         </w:tc>
         <w:tc>
@@ -929,20 +983,41 @@
             <w:vAlign w:val="center"/>
           </w:tcPr>
           <w:p>
-            <w:r>
+            <w:pPr>
+              <w:rPr>
+                <w:highlight w:val="yellow"/>
+              </w:rPr>
+            </w:pPr>
+            <w:proofErr w:type="spellStart"/>
+            <w:r>
+              <w:rPr>
+                <w:highlight w:val="yellow"/>
+              </w:rPr>
               <w:t>P_Tac</w:t>
             </w:r>
-          </w:p>
-        </w:tc>
-        <w:tc>
-          <w:tcPr>
-            <w:tcW w:w="7920" w:type="dxa"/>
-          </w:tcPr>
-          <w:p>
-            <w:r>
+            <w:proofErr w:type="spellEnd"/>
+          </w:p>
+        </w:tc>
+        <w:tc>
+          <w:tcPr>
+            <w:tcW w:w="7920" w:type="dxa"/>
+          </w:tcPr>
+          <w:p>
+            <w:pPr>
+              <w:rPr>
+                <w:highlight w:val="yellow"/>
+              </w:rPr>
+            </w:pPr>
+            <w:r>
+              <w:rPr>
+                <w:highlight w:val="yellow"/>
+              </w:rPr>
               <w:t>AACGATCGTTGGCTGTGTTGACAATTAATCATCGGCTCGTATAATGTGTGGAATTGTGAGCGCTCACAAT</w:t>
             </w:r>
             <w:r>
+              <w:rPr>
+                <w:highlight w:val="yellow"/>
+              </w:rPr>
               <w:br/>
               <w:t>T</w:t>
             </w:r>
@@ -1011,6 +1086,9 @@
             </w:r>
             <w:r>
               <w:br/>
+            </w:r>
+            <w:r>
+              <w:lastRenderedPageBreak/>
               <w:t>TTTTTTCGTTTTCAGAGCAAGAGATTACGCGCAGACCAAAACGATCTCAAGAAGATCATCTTATTAA</w:t>
             </w:r>
           </w:p>
@@ -1023,10 +1101,12 @@
             <w:vAlign w:val="center"/>
           </w:tcPr>
           <w:p>
+            <w:proofErr w:type="spellStart"/>
             <w:r>
               <w:lastRenderedPageBreak/>
               <w:t>phlA</w:t>
             </w:r>
+            <w:proofErr w:type="spellEnd"/>
           </w:p>
         </w:tc>
         <w:tc>
@@ -1107,9 +1187,11 @@
             <w:vAlign w:val="center"/>
           </w:tcPr>
           <w:p>
+            <w:proofErr w:type="spellStart"/>
             <w:r>
               <w:t>phlB</w:t>
             </w:r>
+            <w:proofErr w:type="spellEnd"/>
           </w:p>
         </w:tc>
         <w:tc>
@@ -1154,9 +1236,11 @@
             <w:vAlign w:val="center"/>
           </w:tcPr>
           <w:p>
+            <w:proofErr w:type="spellStart"/>
             <w:r>
               <w:t>phlC</w:t>
             </w:r>
+            <w:proofErr w:type="spellEnd"/>
           </w:p>
         </w:tc>
         <w:tc>
@@ -1169,13 +1253,13 @@
             </w:r>
             <w:r>
               <w:br/>
+            </w:r>
+            <w:r>
+              <w:lastRenderedPageBreak/>
               <w:t>AGACTTTCAAGGAGATGATCGTCGAGTCCGCCTACCAGGCACTCAACGCCATCAAGATGCACCCTCGCGA</w:t>
             </w:r>
             <w:r>
               <w:br/>
-            </w:r>
-            <w:r>
-              <w:lastRenderedPageBreak/>
               <w:t>ACTTCAGGCAGTTGCCTATGGGTACCATGGTGAAGGTATTTCTGAATACGGAGGTCTGGGCCCAACCATC</w:t>
             </w:r>
             <w:r>
@@ -1248,10 +1332,12 @@
             <w:vAlign w:val="center"/>
           </w:tcPr>
           <w:p>
+            <w:proofErr w:type="spellStart"/>
             <w:r>
               <w:lastRenderedPageBreak/>
               <w:t>phlD</w:t>
             </w:r>
+            <w:proofErr w:type="spellEnd"/>
           </w:p>
         </w:tc>
         <w:tc>
@@ -1288,15 +1374,15 @@
             </w:r>
             <w:r>
               <w:br/>
-              <w:t>TCGCCAGCCTGGCGCCGGACAACCATGTGCTCATCGTCTCCCTGGAGTTCTCGTCGCTCTGCTATCAACC</w:t>
-            </w:r>
-            <w:r>
-              <w:br/>
-              <w:t>CCAGGACACCAAGTTGCACGCATTCATCTCAGCGGCATTATTCGGCGATGC</w:t>
+              <w:t>TCGCCAGCCTGGCGCCGGACAACCATGTGCTCATCGTCTCCCTGGAGTTCTCGTCGCTCTGCTA</w:t>
             </w:r>
             <w:r>
               <w:lastRenderedPageBreak/>
-              <w:t>GGTATCAGCCTGCGTAATG</w:t>
+              <w:t>TCAACC</w:t>
+            </w:r>
+            <w:r>
+              <w:br/>
+              <w:t>CCAGGACACCAAGTTGCACGCATTCATCTCAGCGGCATTATTCGGCGATGCGGTATCAGCCTGCGTAATG</w:t>
             </w:r>
             <w:r>
               <w:br/>
@@ -1336,21 +1422,32 @@
             <w:vAlign w:val="center"/>
           </w:tcPr>
           <w:p>
-            <w:r>
+            <w:proofErr w:type="spellStart"/>
+            <w:r>
+              <w:rPr>
+                <w:highlight w:val="yellow"/>
+              </w:rPr>
               <w:lastRenderedPageBreak/>
               <w:t>PlmJ</w:t>
             </w:r>
-          </w:p>
-        </w:tc>
-        <w:tc>
-          <w:tcPr>
-            <w:tcW w:w="7920" w:type="dxa"/>
-          </w:tcPr>
-          <w:p>
-            <w:r>
+            <w:proofErr w:type="spellEnd"/>
+          </w:p>
+        </w:tc>
+        <w:tc>
+          <w:tcPr>
+            <w:tcW w:w="7920" w:type="dxa"/>
+          </w:tcPr>
+          <w:p>
+            <w:r>
+              <w:rPr>
+                <w:highlight w:val="yellow"/>
+              </w:rPr>
               <w:t>AGTCATAAGTCTGGGCTAAGCCCACTGATGAGTCGCTGAAATGCGACGAAACTTATGACCTCTACAAATA</w:t>
             </w:r>
             <w:r>
+              <w:rPr>
+                <w:highlight w:val="yellow"/>
+              </w:rPr>
               <w:br/>
               <w:t>ATTTTGTTTAA</w:t>
             </w:r>
@@ -1411,9 +1508,11 @@
             <w:vAlign w:val="center"/>
           </w:tcPr>
           <w:p>
+            <w:proofErr w:type="spellStart"/>
             <w:r>
               <w:t>RiboJ</w:t>
             </w:r>
+            <w:proofErr w:type="spellEnd"/>
           </w:p>
         </w:tc>
         <w:tc>
@@ -1484,9 +1583,11 @@
             <w:vAlign w:val="center"/>
           </w:tcPr>
           <w:p>
+            <w:proofErr w:type="spellStart"/>
             <w:r>
               <w:t>SarJ</w:t>
             </w:r>
+            <w:proofErr w:type="spellEnd"/>
           </w:p>
         </w:tc>
         <w:tc>
@@ -1511,9 +1612,11 @@
             <w:vAlign w:val="center"/>
           </w:tcPr>
           <w:p>
+            <w:proofErr w:type="spellStart"/>
             <w:r>
               <w:t>tet_R</w:t>
             </w:r>
+            <w:proofErr w:type="spellEnd"/>
           </w:p>
         </w:tc>
         <w:tc>
@@ -1534,7 +1637,11 @@
             </w:r>
             <w:r>
               <w:br/>
-              <w:t>GGCCGCCGCCCAGTCCTGCTCGCTTCGCTACTTGGAGCCACTATCGACTACGCGATCATGGCGACCACAC</w:t>
+              <w:t>GGCCGCCGCCCAGTCCTGCTCGCTTCGCTACTTGGAGCCACTATCGACTACGCGATCATGGCGA</w:t>
+            </w:r>
+            <w:r>
+              <w:lastRenderedPageBreak/>
+              <w:t>CCACAC</w:t>
             </w:r>
             <w:r>
               <w:br/>
@@ -1542,9 +1649,6 @@
             </w:r>
             <w:r>
               <w:br/>
-            </w:r>
-            <w:r>
-              <w:lastRenderedPageBreak/>
               <w:t>CGCCTATATCGCCGACATCACCGATGGGGAAGATCGGGCTCGCCACTTCGGGCTCATGAGCGCTTGTTTC</w:t>
             </w:r>
             <w:r>
@@ -1605,10 +1709,12 @@
             <w:vAlign w:val="center"/>
           </w:tcPr>
           <w:p>
+            <w:proofErr w:type="spellStart"/>
             <w:r>
               <w:lastRenderedPageBreak/>
               <w:t>yfp</w:t>
             </w:r>
+            <w:proofErr w:type="spellEnd"/>
           </w:p>
         </w:tc>
         <w:tc>
@@ -1653,7 +1759,11 @@
             </w:r>
             <w:r>
               <w:br/>
-              <w:t>GACCCCAACGAGAAGCGCGATCACATGGTCCTGCTGGAGTTCGTGACCGCCGCCGGGATCACTCTCGGCA</w:t>
+              <w:t>GACCCCAACGAGAAGCGCGATCACATGGTCCTGCTGGAGTTCGTGACCGCCGCCGGGATCAC</w:t>
+            </w:r>
+            <w:r>
+              <w:lastRenderedPageBreak/>
+              <w:t>TCTCGGCA</w:t>
             </w:r>
             <w:r>
               <w:br/>

</xml_diff>